<commit_message>
Fix nested and mismatched condition blocks in story chapters
- Chapter 6 Scenario A: Fixed nested DELANEY_ALIVE/DELANEY_DEAD blocks
  that had DELANEY_DEAD content incorrectly inside DELANEY_ALIVE block

- Chapter 7 State X: Fixed nested BETRAYED_MILLER blocks where variations
  for MILLER_ALLY and NEITHER states were incorrectly nested inside outer
  BETRAYED_MILLER block

- Chapter 10 Path A: Removed orphan [[END: VIA PATH I-A]] marker that had
  no matching BEGIN (was duplicate after [[END: VIA PATH VII-A]])

All condition blocks now properly validate with matching BEGIN/END pairs.
</commit_message>
<xml_diff>
--- a/story-revised/CoG - Chapter 10 Path A.docx
+++ b/story-revised/CoG - Chapter 10 Path A.docx
@@ -160,11 +160,6 @@
     <w:p>
       <w:r>
         <w:t>[[END: VIA PATH VII-A]]</w:t>
-      </w:r>
-    </w:p>
-    <w:p>
-      <w:r>
-        <w:t>[[END: VIA PATH I-A]]</w:t>
       </w:r>
     </w:p>
     <w:p/>

</xml_diff>

<commit_message>
Revert "Claude/add story choices 01 vvr9w ym bu kq zq qg k lgtp km"
</commit_message>
<xml_diff>
--- a/story-revised/CoG - Chapter 10 Path A.docx
+++ b/story-revised/CoG - Chapter 10 Path A.docx
@@ -1770,93 +1770,93 @@
       <w:r>
         <w:t>"Neither do I. But it's the only price we've got."</w:t>
       </w:r>
-      <w:r>
-        <w:br/>
+    </w:p>
+    <w:p/>
+    <w:p>
+      <w:r>
+        <w:t>DECISION POINT D10-POSITION 1: THE PROSECUTOR'S DILEMMA</w:t>
+      </w:r>
+    </w:p>
+    <w:p>
+      <w:r>
+        <w:t>The Choice: Victor Thorne has been indicted. The legal victory is secured. But the election looms, and even an indicted candidate can win if voters choose to ignore his crimes. The question is whether to trust the legal process to finish the job, or to take additional action to ensure Victor can never threaten anyone again.</w:t>
+      </w:r>
+    </w:p>
+    <w:p>
+      <w:r>
+        <w:t>OPTION 1-A: Pursue Legal Channels — Trust the system. The indictment is strong, the evidence compelling, the witnesses prepared. Let the trial proceed through proper channels, even if that means Victor might make bail, might delay proceedings, might find some legal technicality to exploit. Justice should be slow and certain, not fast and dirty.</w:t>
+      </w:r>
+    </w:p>
+    <w:p>
+      <w:r>
+        <w:t>"We do this right. If we release evidence outside legal channels, Thorne's lawyers will use it to invalidate everything. We indict, we go to trial, we convict. Even if it takes longer than we want."</w:t>
+      </w:r>
+    </w:p>
+    <w:p>
+      <w:r>
+        <w:t>Status Gained:</w:t>
+      </w:r>
+    </w:p>
+    <w:p>
+      <w:r>
+        <w:t>ASSET: Legal Integrity — The case remains untainted by procedural shortcuts</w:t>
+      </w:r>
+    </w:p>
+    <w:p>
+      <w:r>
+        <w:t>LIABILITY: Timeline Risk — Victor has time to maneuver</w:t>
+      </w:r>
+    </w:p>
+    <w:p>
+      <w:r>
+        <w:t>STATUS: Trust in System — The commitment to proper process</w:t>
+      </w:r>
+    </w:p>
+    <w:p>
+      <w:r>
+        <w:t>→ Turn to Chapter 11, Path 1a (Trial Confrontation)</w:t>
+      </w:r>
+    </w:p>
+    <w:p>
+      <w:r>
+        <w:t>OPTION 1-B: Release Evidence Publicly — The election is in two days. Even if Victor is convicted eventually, winning the mayor's office would give him enormous power to delay, obstruct, and possibly escape justice. Release the evidence directly to the press—everything, including the most damaging testimony and documentation—and let public opinion deliver its own verdict before voters go to the polls.</w:t>
+      </w:r>
+    </w:p>
+    <w:p>
+      <w:r>
+        <w:t>"We don't have time for courts. The election is in forty-eight hours. If Thorne wins, he'll have the power to bury everything we've built. The public deserves to see this evidence now, not after months of legal proceedings."</w:t>
+      </w:r>
+    </w:p>
+    <w:p>
+      <w:r>
+        <w:t>Status Gained:</w:t>
+      </w:r>
+    </w:p>
+    <w:p>
+      <w:r>
+        <w:t>ASSET: Public Impact — The evidence reaches voters immediately</w:t>
+      </w:r>
+    </w:p>
+    <w:p>
+      <w:r>
+        <w:t>LIABILITY: Legal Complications — Defense will argue tainted jury pool</w:t>
+      </w:r>
+    </w:p>
+    <w:p>
+      <w:r>
+        <w:t>STATUS: Democratic Justice — Let the people decide</w:t>
+      </w:r>
+    </w:p>
+    <w:p>
+      <w:r>
+        <w:t>→ Turn to Chapter 11, Path 1b (Media Confrontation)</w:t>
+      </w:r>
+    </w:p>
+    <w:p>
+      <w:r>
         <w:t>[[END: INNOCENT_BLOOD]]</w:t>
       </w:r>
     </w:p>
-    <w:p/>
-    <w:p>
-      <w:r>
-        <w:t>DECISION POINT D10-POSITION 1: THE PROSECUTOR'S DILEMMA</w:t>
-      </w:r>
-    </w:p>
-    <w:p>
-      <w:r>
-        <w:t>The Choice: Victor Thorne has been indicted. The legal victory is secured. But the election looms, and even an indicted candidate can win if voters choose to ignore his crimes. The question is whether to trust the legal process to finish the job, or to take additional action to ensure Victor can never threaten anyone again.</w:t>
-      </w:r>
-    </w:p>
-    <w:p>
-      <w:r>
-        <w:t>OPTION 1-A: Pursue Legal Channels — Trust the system. The indictment is strong, the evidence compelling, the witnesses prepared. Let the trial proceed through proper channels, even if that means Victor might make bail, might delay proceedings, might find some legal technicality to exploit. Justice should be slow and certain, not fast and dirty.</w:t>
-      </w:r>
-    </w:p>
-    <w:p>
-      <w:r>
-        <w:t>"We do this right. If we release evidence outside legal channels, Thorne's lawyers will use it to invalidate everything. We indict, we go to trial, we convict. Even if it takes longer than we want."</w:t>
-      </w:r>
-    </w:p>
-    <w:p>
-      <w:r>
-        <w:t>Status Gained:</w:t>
-      </w:r>
-    </w:p>
-    <w:p>
-      <w:r>
-        <w:t>ASSET: Legal Integrity — The case remains untainted by procedural shortcuts</w:t>
-      </w:r>
-    </w:p>
-    <w:p>
-      <w:r>
-        <w:t>LIABILITY: Timeline Risk — Victor has time to maneuver</w:t>
-      </w:r>
-    </w:p>
-    <w:p>
-      <w:r>
-        <w:t>STATUS: Trust in System — The commitment to proper process</w:t>
-      </w:r>
-    </w:p>
-    <w:p>
-      <w:r>
-        <w:t>→ Turn to Chapter 11, Path 1a (Trial Confrontation)</w:t>
-      </w:r>
-    </w:p>
-    <w:p>
-      <w:r>
-        <w:t>OPTION 1-B: Release Evidence Publicly — The election is in two days. Even if Victor is convicted eventually, winning the mayor's office would give him enormous power to delay, obstruct, and possibly escape justice. Release the evidence directly to the press—everything, including the most damaging testimony and documentation—and let public opinion deliver its own verdict before voters go to the polls.</w:t>
-      </w:r>
-    </w:p>
-    <w:p>
-      <w:r>
-        <w:t>"We don't have time for courts. The election is in forty-eight hours. If Thorne wins, he'll have the power to bury everything we've built. The public deserves to see this evidence now, not after months of legal proceedings."</w:t>
-      </w:r>
-    </w:p>
-    <w:p>
-      <w:r>
-        <w:t>Status Gained:</w:t>
-      </w:r>
-    </w:p>
-    <w:p>
-      <w:r>
-        <w:t>ASSET: Public Impact — The evidence reaches voters immediately</w:t>
-      </w:r>
-    </w:p>
-    <w:p>
-      <w:r>
-        <w:t>LIABILITY: Legal Complications — Defense will argue tainted jury pool</w:t>
-      </w:r>
-    </w:p>
-    <w:p>
-      <w:r>
-        <w:t>STATUS: Democratic Justice — Let the people decide</w:t>
-      </w:r>
-    </w:p>
-    <w:p>
-      <w:r>
-        <w:t>→ Turn to Chapter 11, Path 1b (Media Confrontation)</w:t>
-      </w:r>
-    </w:p>
-    <w:p/>
     <w:sectPr>
       <w:pgSz w:w="12240" w:h="15840"/>
       <w:pgMar w:top="1440" w:right="1800" w:bottom="1440" w:left="1800" w:header="720" w:footer="720" w:gutter="0"/>

</xml_diff>

<commit_message>
Revert "Fix nested and mismatched condition blocks in story chapters"
</commit_message>
<xml_diff>
--- a/story-revised/CoG - Chapter 10 Path A.docx
+++ b/story-revised/CoG - Chapter 10 Path A.docx
@@ -160,6 +160,11 @@
     <w:p>
       <w:r>
         <w:t>[[END: VIA PATH VII-A]]</w:t>
+      </w:r>
+    </w:p>
+    <w:p>
+      <w:r>
+        <w:t>[[END: VIA PATH I-A]]</w:t>
       </w:r>
     </w:p>
     <w:p/>

</xml_diff>